<commit_message>
Updated Threat Modeling - Triage Procedure document (corrections from ASA triage procedure)
</commit_message>
<xml_diff>
--- a/source/reference_documents/tertiary_documents/design/Threat Modeling/triage/Threat Modeling - Triage.docx
+++ b/source/reference_documents/tertiary_documents/design/Threat Modeling/triage/Threat Modeling - Triage.docx
@@ -40,7 +40,7 @@
         <w:t xml:space="preserve">Version </w:t>
       </w:r>
       <w:r>
-        <w:t>2</w:t>
+        <w:t>3</w:t>
       </w:r>
     </w:p>
     <w:p>
@@ -57,7 +57,7 @@
         <w:rPr>
           <w:noProof/>
         </w:rPr>
-        <w:t>4/11/25 1:27 PM</w:t>
+        <w:t>5/28/25 2:50 PM</w:t>
       </w:r>
       <w:r>
         <w:fldChar w:fldCharType="end"/>
@@ -830,13 +830,79 @@
         <w:t xml:space="preserve">It is required that the </w:t>
       </w:r>
       <w:r>
+        <w:t>threat candidates</w:t>
+      </w:r>
+      <w:r>
+        <w:t xml:space="preserve">, created in the </w:t>
+      </w:r>
+      <w:r>
+        <w:t>threat modeling</w:t>
+      </w:r>
+      <w:r>
+        <w:t xml:space="preserve"> </w:t>
+      </w:r>
+      <w:r>
+        <w:rPr>
+          <w:b/>
+          <w:bCs/>
+        </w:rPr>
+        <w:t xml:space="preserve">model </w:t>
+      </w:r>
+      <w:r>
+        <w:rPr>
+          <w:b/>
+          <w:bCs/>
+        </w:rPr>
+        <w:t>analysis</w:t>
+      </w:r>
+      <w:r>
+        <w:t xml:space="preserve"> activity, be available.</w:t>
+      </w:r>
+    </w:p>
+    <w:p>
+      <w:pPr>
+        <w:pStyle w:val="BodyText"/>
+      </w:pPr>
+      <w:r>
+        <w:t>Additionally, i</w:t>
+      </w:r>
+      <w:r>
+        <w:t xml:space="preserve">t </w:t>
+      </w:r>
+      <w:r>
+        <w:t xml:space="preserve">is required that the </w:t>
+      </w:r>
+      <w:r>
         <w:t>threat model for</w:t>
       </w:r>
       <w:r>
         <w:t xml:space="preserve"> the element under consideration</w:t>
       </w:r>
       <w:r>
-        <w:t>, created in the threat model creation activity, be available.</w:t>
+        <w:t>, created in the threat model</w:t>
+      </w:r>
+      <w:r>
+        <w:t xml:space="preserve">ing </w:t>
+      </w:r>
+      <w:r>
+        <w:rPr>
+          <w:b/>
+          <w:bCs/>
+        </w:rPr>
+        <w:t>model</w:t>
+      </w:r>
+      <w:r>
+        <w:t xml:space="preserve"> </w:t>
+      </w:r>
+      <w:r>
+        <w:rPr>
+          <w:b/>
+          <w:bCs/>
+        </w:rPr>
+        <w:t>creation</w:t>
+      </w:r>
+      <w:r>
+        <w:t xml:space="preserve"> activity, be available.</w:t>
       </w:r>
     </w:p>
     <w:p>
@@ -1100,13 +1166,53 @@
         <w:ind w:left="360"/>
       </w:pPr>
       <w:r>
-        <w:t>A threat candidate exposes incomplete / incorrect information forming the model. The model</w:t>
+        <w:t>A threat candidate is determined to be plausible. It will be marked as such and where possible</w:t>
       </w:r>
       <w:r>
         <w:t xml:space="preserve"> </w:t>
       </w:r>
       <w:r>
-        <w:t>will need to be updated, and analysis redone.</w:t>
+        <w:t xml:space="preserve">given a preliminary severity (where the severity designation may be used as a </w:t>
+      </w:r>
+      <w:r>
+        <w:rPr>
+          <w:b/>
+          <w:bCs/>
+        </w:rPr>
+        <w:t>bug bar</w:t>
+      </w:r>
+      <w:r>
+        <w:t xml:space="preserve"> </w:t>
+      </w:r>
+      <w:r>
+        <w:rPr>
+          <w:b/>
+          <w:bCs/>
+          <w:color w:val="0070C0"/>
+          <w:vertAlign w:val="superscript"/>
+        </w:rPr>
+        <w:t>[</w:t>
+      </w:r>
+      <w:r>
+        <w:rPr>
+          <w:b/>
+          <w:bCs/>
+          <w:color w:val="0070C0"/>
+          <w:vertAlign w:val="superscript"/>
+        </w:rPr>
+        <w:t>8</w:t>
+      </w:r>
+      <w:r>
+        <w:rPr>
+          <w:b/>
+          <w:bCs/>
+          <w:color w:val="0070C0"/>
+          <w:vertAlign w:val="superscript"/>
+        </w:rPr>
+        <w:t>]</w:t>
+      </w:r>
+      <w:r>
+        <w:t>).</w:t>
       </w:r>
     </w:p>
     <w:p>
@@ -1119,13 +1225,13 @@
         <w:ind w:left="360"/>
       </w:pPr>
       <w:r>
-        <w:t>A threat candidate is determined to be a non-issue due to circumstances not captured by the</w:t>
+        <w:t>A threat candidate exposes incomplete / incorrect information forming the model. The model</w:t>
       </w:r>
       <w:r>
         <w:t xml:space="preserve"> </w:t>
       </w:r>
       <w:r>
-        <w:t>model. It will be marked as such and removed from consideration.</w:t>
+        <w:t>will need to be updated, and analysis redone.</w:t>
       </w:r>
     </w:p>
     <w:p>
@@ -1138,53 +1244,13 @@
         <w:ind w:left="360"/>
       </w:pPr>
       <w:r>
-        <w:t>A threat candidate is determined to be plausible. It will be marked as such and where possible</w:t>
+        <w:t>A threat candidate is determined to be a non-issue due to circumstances not captured by the</w:t>
       </w:r>
       <w:r>
         <w:t xml:space="preserve"> </w:t>
       </w:r>
       <w:r>
-        <w:t xml:space="preserve">given a preliminary severity (where the severity designation may be used as a </w:t>
-      </w:r>
-      <w:r>
-        <w:rPr>
-          <w:b/>
-          <w:bCs/>
-        </w:rPr>
-        <w:t>bug bar</w:t>
-      </w:r>
-      <w:r>
-        <w:t xml:space="preserve"> </w:t>
-      </w:r>
-      <w:r>
-        <w:rPr>
-          <w:b/>
-          <w:bCs/>
-          <w:color w:val="0070C0"/>
-          <w:vertAlign w:val="superscript"/>
-        </w:rPr>
-        <w:t>[</w:t>
-      </w:r>
-      <w:r>
-        <w:rPr>
-          <w:b/>
-          <w:bCs/>
-          <w:color w:val="0070C0"/>
-          <w:vertAlign w:val="superscript"/>
-        </w:rPr>
-        <w:t>8</w:t>
-      </w:r>
-      <w:r>
-        <w:rPr>
-          <w:b/>
-          <w:bCs/>
-          <w:color w:val="0070C0"/>
-          <w:vertAlign w:val="superscript"/>
-        </w:rPr>
-        <w:t>]</w:t>
-      </w:r>
-      <w:r>
-        <w:t>).</w:t>
+        <w:t>model. It will be marked as such and removed from consideration.</w:t>
       </w:r>
     </w:p>
     <w:p>
@@ -2147,7 +2213,13 @@
         <w:t xml:space="preserve"> is the element </w:t>
       </w:r>
       <w:r>
-        <w:t>being modeled</w:t>
+        <w:t xml:space="preserve">whose </w:t>
+      </w:r>
+      <w:r>
+        <w:t>threat modeling</w:t>
+      </w:r>
+      <w:r>
+        <w:t xml:space="preserve"> issues are being triaged</w:t>
       </w:r>
       <w:r>
         <w:t>.</w:t>
@@ -2588,22 +2660,11 @@
           <w:bCs/>
           <w:color w:val="0070C0"/>
         </w:rPr>
-        <w:t>Note</w:t>
-      </w:r>
-      <w:r>
-        <w:rPr>
-          <w:b/>
-          <w:bCs/>
-          <w:color w:val="0070C0"/>
-        </w:rPr>
-        <w:t>:</w:t>
+        <w:t>Note:</w:t>
       </w:r>
       <w:r>
         <w:tab/>
-        <w:t>These references are those necessary fo</w:t>
-      </w:r>
-      <w:r>
-        <w:t xml:space="preserve">r </w:t>
+        <w:t xml:space="preserve">These references are those necessary for </w:t>
       </w:r>
       <w:r>
         <w:t xml:space="preserve">the creation of the </w:t>
@@ -2612,10 +2673,19 @@
         <w:t>element</w:t>
       </w:r>
       <w:r>
-        <w:t>’s threat</w:t>
-      </w:r>
-      <w:r>
-        <w:t xml:space="preserve"> model.</w:t>
+        <w:t xml:space="preserve">’s </w:t>
+      </w:r>
+      <w:r>
+        <w:t>threat modeling</w:t>
+      </w:r>
+      <w:r>
+        <w:t xml:space="preserve"> </w:t>
+      </w:r>
+      <w:r>
+        <w:t>issue triage</w:t>
+      </w:r>
+      <w:r>
+        <w:t>.</w:t>
       </w:r>
     </w:p>
     <w:p>
@@ -3076,10 +3146,10 @@
           <w:noProof/>
         </w:rPr>
         <w:drawing>
-          <wp:inline distT="0" distB="0" distL="0" distR="0" wp14:anchorId="1D52AD61" wp14:editId="1B28EEA1">
-            <wp:extent cx="1152525" cy="750229"/>
-            <wp:effectExtent l="0" t="0" r="3175" b="0"/>
-            <wp:docPr id="280682368" name="Picture 6" descr="A screenshot of a computer&#10;&#10;AI-generated content may be incorrect."/>
+          <wp:inline distT="0" distB="0" distL="0" distR="0" wp14:anchorId="1D52AD61" wp14:editId="56D3667F">
+            <wp:extent cx="1162630" cy="750083"/>
+            <wp:effectExtent l="0" t="0" r="6350" b="0"/>
+            <wp:docPr id="280682368" name="Picture 6"/>
             <wp:cNvGraphicFramePr>
               <a:graphicFrameLocks xmlns:a="http://schemas.openxmlformats.org/drawingml/2006/main" noChangeAspect="1"/>
             </wp:cNvGraphicFramePr>
@@ -3087,7 +3157,7 @@
               <a:graphicData uri="http://schemas.openxmlformats.org/drawingml/2006/picture">
                 <pic:pic xmlns:pic="http://schemas.openxmlformats.org/drawingml/2006/picture">
                   <pic:nvPicPr>
-                    <pic:cNvPr id="280682368" name="Picture 6" descr="A screenshot of a computer&#10;&#10;AI-generated content may be incorrect."/>
+                    <pic:cNvPr id="280682368" name="Picture 6"/>
                     <pic:cNvPicPr/>
                   </pic:nvPicPr>
                   <pic:blipFill>
@@ -3099,7 +3169,7 @@
                   <pic:spPr>
                     <a:xfrm>
                       <a:off x="0" y="0"/>
-                      <a:ext cx="1162630" cy="756807"/>
+                      <a:ext cx="1162630" cy="750083"/>
                     </a:xfrm>
                     <a:prstGeom prst="rect">
                       <a:avLst/>

</xml_diff>

<commit_message>
updated Threat Modeling Triage Procedure tertiary document (left out preliminary severity field and discussion of it)
</commit_message>
<xml_diff>
--- a/source/reference_documents/tertiary_documents/design/Threat Modeling/triage/Threat Modeling - Triage.docx
+++ b/source/reference_documents/tertiary_documents/design/Threat Modeling/triage/Threat Modeling - Triage.docx
@@ -40,7 +40,7 @@
         <w:t xml:space="preserve">Version </w:t>
       </w:r>
       <w:r>
-        <w:t>3</w:t>
+        <w:t>4</w:t>
       </w:r>
     </w:p>
     <w:p>
@@ -57,7 +57,7 @@
         <w:rPr>
           <w:noProof/>
         </w:rPr>
-        <w:t>5/28/25 2:50 PM</w:t>
+        <w:t>6/17/25 8:03 AM</w:t>
       </w:r>
       <w:r>
         <w:fldChar w:fldCharType="end"/>
@@ -334,11 +334,91 @@
     </w:p>
     <w:p>
       <w:pPr>
+        <w:pStyle w:val="Heading1"/>
+      </w:pPr>
+      <w:r>
+        <w:t>License</w:t>
+      </w:r>
+    </w:p>
+    <w:p>
+      <w:r>
+        <w:t xml:space="preserve">This work </w:t>
+      </w:r>
+      <w:r>
+        <w:t xml:space="preserve">was created by </w:t>
+      </w:r>
+      <w:r>
+        <w:rPr>
+          <w:b/>
+          <w:bCs/>
+        </w:rPr>
+        <w:t>Torc Robotics</w:t>
+      </w:r>
+      <w:r>
+        <w:t xml:space="preserve"> and </w:t>
+      </w:r>
+      <w:r>
+        <w:t xml:space="preserve">is licensed under the </w:t>
+      </w:r>
+      <w:r>
+        <w:rPr>
+          <w:b/>
+          <w:bCs/>
+        </w:rPr>
+        <w:t>Creative Commons Attribution-Share Alike (CC</w:t>
+      </w:r>
+      <w:r>
+        <w:rPr>
+          <w:b/>
+          <w:bCs/>
+        </w:rPr>
+        <w:t xml:space="preserve"> BY</w:t>
+      </w:r>
+      <w:r>
+        <w:rPr>
+          <w:b/>
+          <w:bCs/>
+        </w:rPr>
+        <w:t>-SA</w:t>
+      </w:r>
+      <w:r>
+        <w:rPr>
+          <w:b/>
+          <w:bCs/>
+        </w:rPr>
+        <w:t>-4.0</w:t>
+      </w:r>
+      <w:r>
+        <w:rPr>
+          <w:b/>
+          <w:bCs/>
+        </w:rPr>
+        <w:t>)</w:t>
+      </w:r>
+      <w:r>
+        <w:t xml:space="preserve"> License</w:t>
+      </w:r>
+      <w:r>
+        <w:t>.</w:t>
+      </w:r>
+    </w:p>
+    <w:p>
+      <w:pPr>
         <w:rPr>
           <w:sz w:val="40"/>
           <w:szCs w:val="40"/>
         </w:rPr>
       </w:pPr>
+      <w:hyperlink r:id="rId7" w:history="1">
+        <w:r>
+          <w:rPr>
+            <w:rStyle w:val="Hyperlink"/>
+            <w:rFonts w:cs="Courier New"/>
+            <w:bCs/>
+          </w:rPr>
+          <w:t>https://creativecommons.org/licenses/by/4.0/legalcode</w:t>
+        </w:r>
+      </w:hyperlink>
       <w:r>
         <w:br w:type="page"/>
       </w:r>
@@ -1097,7 +1177,7 @@
                     <pic:cNvPicPr/>
                   </pic:nvPicPr>
                   <pic:blipFill>
-                    <a:blip r:embed="rId7"/>
+                    <a:blip r:embed="rId8"/>
                     <a:stretch>
                       <a:fillRect/>
                     </a:stretch>
@@ -1436,7 +1516,7 @@
                     <pic:cNvPicPr/>
                   </pic:nvPicPr>
                   <pic:blipFill>
-                    <a:blip r:embed="rId8"/>
+                    <a:blip r:embed="rId9"/>
                     <a:stretch>
                       <a:fillRect/>
                     </a:stretch>
@@ -2153,7 +2233,7 @@
                     <pic:cNvPicPr/>
                   </pic:nvPicPr>
                   <pic:blipFill>
-                    <a:blip r:embed="rId9"/>
+                    <a:blip r:embed="rId10"/>
                     <a:stretch>
                       <a:fillRect/>
                     </a:stretch>
@@ -2213,13 +2293,7 @@
         <w:t xml:space="preserve"> is the element </w:t>
       </w:r>
       <w:r>
-        <w:t xml:space="preserve">whose </w:t>
-      </w:r>
-      <w:r>
-        <w:t>threat modeling</w:t>
-      </w:r>
-      <w:r>
-        <w:t xml:space="preserve"> issues are being triaged</w:t>
+        <w:t>whose threat modeling issues are being triaged</w:t>
       </w:r>
       <w:r>
         <w:t>.</w:t>
@@ -2502,7 +2576,7 @@
                     <pic:cNvPicPr/>
                   </pic:nvPicPr>
                   <pic:blipFill>
-                    <a:blip r:embed="rId10"/>
+                    <a:blip r:embed="rId11"/>
                     <a:stretch>
                       <a:fillRect/>
                     </a:stretch>
@@ -2673,10 +2747,7 @@
         <w:t>element</w:t>
       </w:r>
       <w:r>
-        <w:t xml:space="preserve">’s </w:t>
-      </w:r>
-      <w:r>
-        <w:t>threat modeling</w:t>
+        <w:t>’s threat modeling</w:t>
       </w:r>
       <w:r>
         <w:t xml:space="preserve"> </w:t>
@@ -2768,7 +2839,7 @@
                     <pic:cNvPicPr/>
                   </pic:nvPicPr>
                   <pic:blipFill>
-                    <a:blip r:embed="rId11"/>
+                    <a:blip r:embed="rId12"/>
                     <a:stretch>
                       <a:fillRect/>
                     </a:stretch>
@@ -2877,10 +2948,10 @@
           <w:noProof/>
         </w:rPr>
         <w:drawing>
-          <wp:inline distT="0" distB="0" distL="0" distR="0" wp14:anchorId="200A7650" wp14:editId="0D9F4052">
-            <wp:extent cx="5934710" cy="1518285"/>
-            <wp:effectExtent l="0" t="0" r="0" b="5715"/>
-            <wp:docPr id="170471096" name="Picture 5" descr="A notepad with a note and a note&#10;&#10;AI-generated content may be incorrect."/>
+          <wp:inline distT="0" distB="0" distL="0" distR="0" wp14:anchorId="200A7650" wp14:editId="773888C1">
+            <wp:extent cx="5934710" cy="1255861"/>
+            <wp:effectExtent l="0" t="0" r="0" b="1905"/>
+            <wp:docPr id="170471096" name="Picture 5"/>
             <wp:cNvGraphicFramePr>
               <a:graphicFrameLocks xmlns:a="http://schemas.openxmlformats.org/drawingml/2006/main" noChangeAspect="1"/>
             </wp:cNvGraphicFramePr>
@@ -2888,11 +2959,11 @@
               <a:graphicData uri="http://schemas.openxmlformats.org/drawingml/2006/picture">
                 <pic:pic xmlns:pic="http://schemas.openxmlformats.org/drawingml/2006/picture">
                   <pic:nvPicPr>
-                    <pic:cNvPr id="170471096" name="Picture 5" descr="A notepad with a note and a note&#10;&#10;AI-generated content may be incorrect."/>
+                    <pic:cNvPr id="170471096" name="Picture 5"/>
                     <pic:cNvPicPr/>
                   </pic:nvPicPr>
                   <pic:blipFill>
-                    <a:blip r:embed="rId12"/>
+                    <a:blip r:embed="rId13"/>
                     <a:stretch>
                       <a:fillRect/>
                     </a:stretch>
@@ -2900,7 +2971,7 @@
                   <pic:spPr>
                     <a:xfrm>
                       <a:off x="0" y="0"/>
-                      <a:ext cx="5934710" cy="1518285"/>
+                      <a:ext cx="5934710" cy="1255861"/>
                     </a:xfrm>
                     <a:prstGeom prst="rect">
                       <a:avLst/>
@@ -3022,6 +3093,119 @@
       </w:r>
       <w:r>
         <w:t>The meanings of these were covered earlier in this document</w:t>
+      </w:r>
+      <w:r>
+        <w:t>.</w:t>
+      </w:r>
+    </w:p>
+    <w:p>
+      <w:pPr>
+        <w:pStyle w:val="Heading3"/>
+      </w:pPr>
+      <w:r>
+        <w:t>Preliminary Severity (optional)</w:t>
+      </w:r>
+    </w:p>
+    <w:p>
+      <w:r>
+        <w:t xml:space="preserve">If the determination is that the issue is </w:t>
+      </w:r>
+      <w:r>
+        <w:t>valid</w:t>
+      </w:r>
+      <w:r>
+        <w:t xml:space="preserve">, a </w:t>
+      </w:r>
+      <w:r>
+        <w:rPr>
+          <w:b/>
+          <w:bCs/>
+        </w:rPr>
+        <w:t>preliminary severity</w:t>
+      </w:r>
+      <w:r>
+        <w:t xml:space="preserve"> (rank / likelihood) may be </w:t>
+      </w:r>
+      <w:r>
+        <w:t>provided</w:t>
+      </w:r>
+      <w:r>
+        <w:t>.</w:t>
+      </w:r>
+    </w:p>
+    <w:p>
+      <w:pPr>
+        <w:pStyle w:val="Note"/>
+      </w:pPr>
+      <w:r>
+        <w:rPr>
+          <w:b/>
+          <w:bCs/>
+          <w:color w:val="0070C0"/>
+        </w:rPr>
+        <w:t>Note:</w:t>
+      </w:r>
+      <w:r>
+        <w:tab/>
+      </w:r>
+      <w:r>
+        <w:t xml:space="preserve">The </w:t>
+      </w:r>
+      <w:r>
+        <w:rPr>
+          <w:b/>
+          <w:bCs/>
+        </w:rPr>
+        <w:t>preliminary severity</w:t>
+      </w:r>
+      <w:r>
+        <w:t xml:space="preserve"> value set is not </w:t>
+      </w:r>
+      <w:r>
+        <w:t>provided</w:t>
+      </w:r>
+      <w:r>
+        <w:t xml:space="preserve"> as it is highly specific to the organizational</w:t>
+      </w:r>
+      <w:r>
+        <w:t xml:space="preserve"> and domain</w:t>
+      </w:r>
+      <w:r>
+        <w:t>.</w:t>
+      </w:r>
+      <w:r>
+        <w:t xml:space="preserve"> </w:t>
+      </w:r>
+      <w:r>
+        <w:t>A discussion of q</w:t>
+      </w:r>
+      <w:r>
+        <w:t xml:space="preserve">uantized rank values </w:t>
+      </w:r>
+      <w:r>
+        <w:t>can be found</w:t>
+      </w:r>
+      <w:r>
+        <w:t xml:space="preserve"> in the </w:t>
+      </w:r>
+      <w:r>
+        <w:rPr>
+          <w:b/>
+          <w:bCs/>
+        </w:rPr>
+        <w:t>Ranked / Risked Threat Report</w:t>
+      </w:r>
+      <w:r>
+        <w:rPr>
+          <w:b/>
+          <w:bCs/>
+          <w:color w:val="0070C0"/>
+          <w:vertAlign w:val="superscript"/>
+        </w:rPr>
+        <w:t xml:space="preserve"> [10]</w:t>
+      </w:r>
+      <w:r>
+        <w:t xml:space="preserve"> ACVDL secondary document</w:t>
       </w:r>
       <w:r>
         <w:t>.</w:t>
@@ -3161,7 +3345,7 @@
                     <pic:cNvPicPr/>
                   </pic:nvPicPr>
                   <pic:blipFill>
-                    <a:blip r:embed="rId13"/>
+                    <a:blip r:embed="rId14"/>
                     <a:stretch>
                       <a:fillRect/>
                     </a:stretch>
@@ -3579,11 +3763,35 @@
         <w:t>AVCDL secondary document)</w:t>
       </w:r>
     </w:p>
+    <w:p>
+      <w:pPr>
+        <w:pStyle w:val="ListParagraph"/>
+        <w:numPr>
+          <w:ilvl w:val="0"/>
+          <w:numId w:val="3"/>
+        </w:numPr>
+        <w:ind w:left="360"/>
+      </w:pPr>
+      <w:r>
+        <w:rPr>
+          <w:b/>
+          <w:bCs/>
+          <w:lang w:val="en"/>
+        </w:rPr>
+        <w:t xml:space="preserve">Ranked – Risked Threat Report </w:t>
+      </w:r>
+      <w:r>
+        <w:rPr>
+          <w:lang w:val="en"/>
+        </w:rPr>
+        <w:t>(AVCDL secondary document)</w:t>
+      </w:r>
+    </w:p>
     <w:p/>
     <w:sectPr>
-      <w:footerReference w:type="even" r:id="rId14"/>
-      <w:footerReference w:type="default" r:id="rId15"/>
-      <w:headerReference w:type="first" r:id="rId16"/>
+      <w:footerReference w:type="even" r:id="rId15"/>
+      <w:footerReference w:type="default" r:id="rId16"/>
+      <w:headerReference w:type="first" r:id="rId17"/>
       <w:pgSz w:w="12226" w:h="15840"/>
       <w:pgMar w:top="1440" w:right="1440" w:bottom="1440" w:left="1440" w:header="720" w:footer="0" w:gutter="0"/>
       <w:pgNumType w:start="1"/>
@@ -6372,11 +6580,12 @@
     <w:next w:val="Normal"/>
     <w:uiPriority w:val="9"/>
     <w:qFormat/>
-    <w:rsid w:val="00CC53A3"/>
+    <w:rsid w:val="00056AE4"/>
     <w:pPr>
       <w:keepNext/>
       <w:keepLines/>
       <w:spacing w:before="400" w:after="120"/>
+      <w:jc w:val="left"/>
       <w:outlineLvl w:val="0"/>
     </w:pPr>
     <w:rPr>
@@ -6391,11 +6600,12 @@
     <w:uiPriority w:val="9"/>
     <w:unhideWhenUsed/>
     <w:qFormat/>
-    <w:rsid w:val="00CC53A3"/>
+    <w:rsid w:val="00056AE4"/>
     <w:pPr>
       <w:keepNext/>
       <w:keepLines/>
       <w:spacing w:before="360" w:after="120"/>
+      <w:jc w:val="left"/>
       <w:outlineLvl w:val="1"/>
     </w:pPr>
     <w:rPr>
@@ -6632,13 +6842,14 @@
     <w:basedOn w:val="BodyText"/>
     <w:uiPriority w:val="34"/>
     <w:qFormat/>
-    <w:rsid w:val="00CC53A3"/>
+    <w:rsid w:val="00056AE4"/>
     <w:pPr>
       <w:numPr>
         <w:numId w:val="12"/>
       </w:numPr>
       <w:ind w:left="270" w:hanging="270"/>
       <w:contextualSpacing/>
+      <w:jc w:val="left"/>
     </w:pPr>
     <w:rPr>
       <w:rFonts w:cs="Arial"/>

</xml_diff>